<commit_message>
Update thesis document and add backup file
Revised the `tesis.docx` to incorporate recent feedback and improvements, including citations and methodological clarifications. A backup of the previous version has been created as `tesis.docx.bak-20260701132729` for reference. Additionally, updated the `dictamen-tesis.md` to reflect changes in the problem statement, methodology, and literature review, enhancing the overall quality and academic rigor of the thesis.
</commit_message>
<xml_diff>
--- a/tesis.docx
+++ b/tesis.docx
@@ -272,7 +272,7 @@
     </w:p>
     <w:p>
       <w:r>
-        <w:t xml:space="preserve">El trabajo independiente en el sector del software y los servicios digitales ha crecido de forma sostenida. El freelancer que ofrece desarrollo web, diseño, marketing o consultoría opera, en la mayoría de los casos, como una unidad de una sola persona: es simultáneamente quien vende, produce, factura y da soporte. A diferencia de una empresa con áreas comerciales y administrativas diferenciadas, el profesional independiente concentra todas esas funciones, lo que traslada una parte significativa de su tiempo productivo hacia tareas administrativas de bajo valor agregado.</w:t>
+        <w:t xml:space="preserve">El trabajo independiente en el sector del software y los servicios digitales ha crecido de forma sostenida: el Online Labour Index registró un aumento cercano al 21 % en la demanda de trabajo digital por proyecto entre 2016 y 2018 (Kässi y Lehdonvirta, 2018), y en América Latina y el Caribe la Organización Internacional del Trabajo documenta una expansión reciente del trabajo mediado por plataformas digitales basadas en la web (OIT, 2025). El freelancer que ofrece desarrollo web, diseño, marketing o consultoría opera, en la mayoría de los casos, como una unidad de una sola persona: es simultáneamente quien vende, produce, factura y da soporte. A diferencia de una empresa con áreas comerciales y administrativas diferenciadas, el profesional independiente concentra todas esas funciones, lo que traslada una parte significativa de su tiempo productivo hacia tareas administrativas de bajo valor agregado.</w:t>
       </w:r>
     </w:p>
     <w:p>
@@ -996,7 +996,7 @@
     </w:p>
     <w:p>
       <w:r>
-        <w:t xml:space="preserve">El relevamiento del problema y de los requisitos se apoyó en el análisis del dominio del trabajo freelance —las tareas administrativas recurrentes y su secuencia— y en la observación de las dificultades que enfrentan los programadores junior para insertarse en el mercado. A partir de ese análisis se derivaron los estados del ciclo de vida del cliente y las reglas de negocio que el sistema debía automatizar.</w:t>
+        <w:t xml:space="preserve">Dada la naturaleza del trabajo —un desarrollo tecnológico aplicado orientado a un MVP (§3.1)—, el relevamiento de requisitos se realizó mediante análisis documental del dominio del trabajo freelance en lugar de un estudio empírico con usuarios. Se caracterizó la secuencia de tareas administrativas del ciclo comercial del profesional independiente a partir de la literatura sobre gestión y automatización de leads (Järvinen y Taiminen, 2016) y de los datos sobre la expansión del trabajo independiente y mediado por plataformas (Kässi y Lehdonvirta, 2018; OIT, 2025), complementados con la experiencia directa de los autores en el desarrollo freelance. De ese análisis se derivaron los estados del ciclo de vida del cliente (Tabla 7) y las reglas de negocio (§4.8) que el sistema debía automatizar. Se reconoce como limitación metodológica la ausencia de un relevamiento primario con usuarios reales —encuestas o entrevistas a una muestra de freelancers—; su incorporación, que permitiría validar empíricamente las prioridades y los umbrales de scoring, se plantea como línea de trabajo futuro (Capítulo 8).</w:t>
       </w:r>
     </w:p>
     <w:p>
@@ -6379,6 +6379,26 @@
       </w:r>
     </w:p>
     <w:p>
+      <w:pPr>
+        <w:ind w:left="720" w:hanging="360"/>
+      </w:pPr>
+      <w:r>
+        <w:rPr>
+          <w:b/>
+        </w:rPr>
+        <w:t xml:space="preserve">7. </w:t>
+      </w:r>
+      <w:r>
+        <w:rPr>
+          <w:b/>
+        </w:rPr>
+        <w:t xml:space="preserve">Realizar un relevamiento primario con usuarios reales.</w:t>
+      </w:r>
+      <w:r>
+        <w:t xml:space="preserve"> Encuestar o entrevistar a una muestra de freelancers para validar empíricamente las prioridades del ciclo comercial y calibrar los umbrales y ponderaciones del scoring (§3.3, §6).</w:t>
+      </w:r>
+    </w:p>
+    <w:p>
       <w:r>
         <w:br w:type="page"/>
       </w:r>
@@ -6477,6 +6497,20 @@
     </w:p>
     <w:p>
       <w:r>
+        <w:t xml:space="preserve">Kässi, O., &amp; Lehdonvirta, V. (2018). Online labour index: Measuring the online gig economy for policy and research. </w:t>
+      </w:r>
+      <w:r>
+        <w:rPr>
+          <w:i/>
+        </w:rPr>
+        <w:t xml:space="preserve">Technological Forecasting and Social Change, 137</w:t>
+      </w:r>
+      <w:r>
+        <w:t xml:space="preserve">, 241–248. https://doi.org/10.1016/j.techfore.2018.07.056</w:t>
+      </w:r>
+    </w:p>
+    <w:p>
+      <w:r>
         <w:t xml:space="preserve">Kotler, P., &amp; Armstrong, G. (2017). </w:t>
       </w:r>
       <w:r>
@@ -6515,6 +6549,20 @@
       </w:r>
       <w:r>
         <w:t xml:space="preserve">. https://docs.n8n.io</w:t>
+      </w:r>
+    </w:p>
+    <w:p>
+      <w:r>
+        <w:t xml:space="preserve">Organización Internacional del Trabajo. (2025). </w:t>
+      </w:r>
+      <w:r>
+        <w:rPr>
+          <w:i/>
+        </w:rPr>
+        <w:t xml:space="preserve">Encuesta sobre trabajadores en plataformas digitales basadas en la web</w:t>
+      </w:r>
+      <w:r>
+        <w:t xml:space="preserve"> [Informe]. OIT. https://www.ilo.org/sites/default/files/2025-04/Informe%20Plataformas%20Digitales_ESP_web.pdf</w:t>
       </w:r>
     </w:p>
     <w:p>

</xml_diff>

<commit_message>
Add thesis document and backup file
Introduced a new version of the `tesis.docx` document, reflecting recent updates and improvements. Additionally, created a backup file `tesis.docx.bak-20260701185752` for reference. This update ensures the thesis is aligned with the latest project developments.
</commit_message>
<xml_diff>
--- a/tesis.docx
+++ b/tesis.docx
@@ -261,1170 +261,6 @@
         <w:t>; Next.js.</w:t>
       </w:r>
     </w:p>
-    <w:p/>
-    <w:p>
-      <w:pPr>
-        <w:pStyle w:val="Ttulo2"/>
-      </w:pPr>
-      <w:bookmarkStart w:id="1" w:name="_Toc233808407"/>
-      <w:proofErr w:type="spellStart"/>
-      <w:r>
-        <w:t>Abstract</w:t>
-      </w:r>
-      <w:bookmarkEnd w:id="1"/>
-      <w:proofErr w:type="spellEnd"/>
-    </w:p>
-    <w:p>
-      <w:proofErr w:type="spellStart"/>
-      <w:r>
-        <w:t>This</w:t>
-      </w:r>
-      <w:proofErr w:type="spellEnd"/>
-      <w:r>
-        <w:t xml:space="preserve"> </w:t>
-      </w:r>
-      <w:proofErr w:type="spellStart"/>
-      <w:r>
-        <w:t>work</w:t>
-      </w:r>
-      <w:proofErr w:type="spellEnd"/>
-      <w:r>
-        <w:t xml:space="preserve"> </w:t>
-      </w:r>
-      <w:proofErr w:type="spellStart"/>
-      <w:r>
-        <w:t>addresses</w:t>
-      </w:r>
-      <w:proofErr w:type="spellEnd"/>
-      <w:r>
-        <w:t xml:space="preserve"> </w:t>
-      </w:r>
-      <w:proofErr w:type="spellStart"/>
-      <w:r>
-        <w:t>the</w:t>
-      </w:r>
-      <w:proofErr w:type="spellEnd"/>
-      <w:r>
-        <w:t xml:space="preserve"> administrative </w:t>
-      </w:r>
-      <w:proofErr w:type="spellStart"/>
-      <w:r>
-        <w:t>burden</w:t>
-      </w:r>
-      <w:proofErr w:type="spellEnd"/>
-      <w:r>
-        <w:t xml:space="preserve"> </w:t>
-      </w:r>
-      <w:proofErr w:type="spellStart"/>
-      <w:r>
-        <w:t>faced</w:t>
-      </w:r>
-      <w:proofErr w:type="spellEnd"/>
-      <w:r>
-        <w:t xml:space="preserve"> </w:t>
-      </w:r>
-      <w:proofErr w:type="spellStart"/>
-      <w:r>
-        <w:t>by</w:t>
-      </w:r>
-      <w:proofErr w:type="spellEnd"/>
-      <w:r>
-        <w:t xml:space="preserve"> solo </w:t>
-      </w:r>
-      <w:proofErr w:type="spellStart"/>
-      <w:r>
-        <w:t>freelancers</w:t>
-      </w:r>
-      <w:proofErr w:type="spellEnd"/>
-      <w:r>
-        <w:t xml:space="preserve">, </w:t>
-      </w:r>
-      <w:proofErr w:type="spellStart"/>
-      <w:r>
-        <w:t>for</w:t>
-      </w:r>
-      <w:proofErr w:type="spellEnd"/>
-      <w:r>
-        <w:t xml:space="preserve"> </w:t>
-      </w:r>
-      <w:proofErr w:type="spellStart"/>
-      <w:r>
-        <w:t>whom</w:t>
-      </w:r>
-      <w:proofErr w:type="spellEnd"/>
-      <w:r>
-        <w:t xml:space="preserve"> </w:t>
-      </w:r>
-      <w:proofErr w:type="spellStart"/>
-      <w:r>
-        <w:t>every</w:t>
-      </w:r>
-      <w:proofErr w:type="spellEnd"/>
-      <w:r>
-        <w:t xml:space="preserve"> prospective </w:t>
-      </w:r>
-      <w:proofErr w:type="spellStart"/>
-      <w:r>
-        <w:t>client</w:t>
-      </w:r>
-      <w:proofErr w:type="spellEnd"/>
-      <w:r>
-        <w:t xml:space="preserve"> </w:t>
-      </w:r>
-      <w:proofErr w:type="spellStart"/>
-      <w:r>
-        <w:t>requires</w:t>
-      </w:r>
-      <w:proofErr w:type="spellEnd"/>
-      <w:r>
-        <w:t xml:space="preserve"> a </w:t>
-      </w:r>
-      <w:proofErr w:type="spellStart"/>
-      <w:r>
-        <w:t>sequence</w:t>
-      </w:r>
-      <w:proofErr w:type="spellEnd"/>
-      <w:r>
-        <w:t xml:space="preserve"> </w:t>
-      </w:r>
-      <w:proofErr w:type="spellStart"/>
-      <w:r>
-        <w:t>of</w:t>
-      </w:r>
-      <w:proofErr w:type="spellEnd"/>
-      <w:r>
-        <w:t xml:space="preserve"> manual, repetitive </w:t>
-      </w:r>
-      <w:proofErr w:type="spellStart"/>
-      <w:r>
-        <w:t>tasks</w:t>
-      </w:r>
-      <w:proofErr w:type="spellEnd"/>
-      <w:r>
-        <w:t xml:space="preserve"> —</w:t>
-      </w:r>
-      <w:proofErr w:type="spellStart"/>
-      <w:r>
-        <w:t>answering</w:t>
-      </w:r>
-      <w:proofErr w:type="spellEnd"/>
-      <w:r>
-        <w:t xml:space="preserve"> </w:t>
-      </w:r>
-      <w:proofErr w:type="spellStart"/>
-      <w:r>
-        <w:t>enquiries</w:t>
-      </w:r>
-      <w:proofErr w:type="spellEnd"/>
-      <w:r>
-        <w:t xml:space="preserve">, </w:t>
-      </w:r>
-      <w:proofErr w:type="spellStart"/>
-      <w:r>
-        <w:t>qualifying</w:t>
-      </w:r>
-      <w:proofErr w:type="spellEnd"/>
-      <w:r>
-        <w:t xml:space="preserve"> </w:t>
-      </w:r>
-      <w:proofErr w:type="spellStart"/>
-      <w:r>
-        <w:t>the</w:t>
-      </w:r>
-      <w:proofErr w:type="spellEnd"/>
-      <w:r>
-        <w:t xml:space="preserve"> </w:t>
-      </w:r>
-      <w:proofErr w:type="spellStart"/>
-      <w:r>
-        <w:t>opportunity</w:t>
-      </w:r>
-      <w:proofErr w:type="spellEnd"/>
-      <w:r>
-        <w:t xml:space="preserve">, </w:t>
-      </w:r>
-      <w:proofErr w:type="spellStart"/>
-      <w:r>
-        <w:t>drafting</w:t>
-      </w:r>
-      <w:proofErr w:type="spellEnd"/>
-      <w:r>
-        <w:t xml:space="preserve"> and </w:t>
-      </w:r>
-      <w:proofErr w:type="spellStart"/>
-      <w:r>
-        <w:t>sending</w:t>
-      </w:r>
-      <w:proofErr w:type="spellEnd"/>
-      <w:r>
-        <w:t xml:space="preserve"> a </w:t>
-      </w:r>
-      <w:proofErr w:type="spellStart"/>
-      <w:r>
-        <w:t>proposal</w:t>
-      </w:r>
-      <w:proofErr w:type="spellEnd"/>
-      <w:r>
-        <w:t xml:space="preserve">, </w:t>
-      </w:r>
-      <w:proofErr w:type="spellStart"/>
-      <w:r>
-        <w:t>following</w:t>
-      </w:r>
-      <w:proofErr w:type="spellEnd"/>
-      <w:r>
-        <w:t xml:space="preserve"> up, </w:t>
-      </w:r>
-      <w:proofErr w:type="spellStart"/>
-      <w:r>
-        <w:t>invoicing</w:t>
-      </w:r>
-      <w:proofErr w:type="spellEnd"/>
-      <w:r>
-        <w:t xml:space="preserve">, </w:t>
-      </w:r>
-      <w:proofErr w:type="spellStart"/>
-      <w:r>
-        <w:t>recording</w:t>
-      </w:r>
-      <w:proofErr w:type="spellEnd"/>
-      <w:r>
-        <w:t xml:space="preserve"> </w:t>
-      </w:r>
-      <w:proofErr w:type="spellStart"/>
-      <w:r>
-        <w:t>payment</w:t>
-      </w:r>
-      <w:proofErr w:type="spellEnd"/>
-      <w:r>
-        <w:t xml:space="preserve"> and </w:t>
-      </w:r>
-      <w:proofErr w:type="spellStart"/>
-      <w:r>
-        <w:t>requesting</w:t>
-      </w:r>
-      <w:proofErr w:type="spellEnd"/>
-      <w:r>
-        <w:t xml:space="preserve"> a testimonial— </w:t>
-      </w:r>
-      <w:proofErr w:type="spellStart"/>
-      <w:r>
-        <w:t>which</w:t>
-      </w:r>
-      <w:proofErr w:type="spellEnd"/>
-      <w:r>
-        <w:t xml:space="preserve">, </w:t>
-      </w:r>
-      <w:proofErr w:type="spellStart"/>
-      <w:r>
-        <w:t>with</w:t>
-      </w:r>
-      <w:proofErr w:type="spellEnd"/>
-      <w:r>
-        <w:t xml:space="preserve"> </w:t>
-      </w:r>
-      <w:proofErr w:type="spellStart"/>
-      <w:r>
-        <w:t>several</w:t>
-      </w:r>
-      <w:proofErr w:type="spellEnd"/>
-      <w:r>
-        <w:t xml:space="preserve"> </w:t>
-      </w:r>
-      <w:proofErr w:type="spellStart"/>
-      <w:r>
-        <w:t>concurrent</w:t>
-      </w:r>
-      <w:proofErr w:type="spellEnd"/>
-      <w:r>
-        <w:t xml:space="preserve"> </w:t>
-      </w:r>
-      <w:proofErr w:type="spellStart"/>
-      <w:r>
-        <w:t>clients</w:t>
-      </w:r>
-      <w:proofErr w:type="spellEnd"/>
-      <w:r>
-        <w:t xml:space="preserve">, pile up, are </w:t>
-      </w:r>
-      <w:proofErr w:type="spellStart"/>
-      <w:r>
-        <w:t>delayed</w:t>
-      </w:r>
-      <w:proofErr w:type="spellEnd"/>
-      <w:r>
-        <w:t xml:space="preserve"> </w:t>
-      </w:r>
-      <w:proofErr w:type="spellStart"/>
-      <w:r>
-        <w:t>or</w:t>
-      </w:r>
-      <w:proofErr w:type="spellEnd"/>
-      <w:r>
-        <w:t xml:space="preserve"> </w:t>
-      </w:r>
-      <w:proofErr w:type="spellStart"/>
-      <w:r>
-        <w:t>forgotten</w:t>
-      </w:r>
-      <w:proofErr w:type="spellEnd"/>
-      <w:r>
-        <w:t xml:space="preserve">, </w:t>
-      </w:r>
-      <w:proofErr w:type="spellStart"/>
-      <w:r>
-        <w:t>causing</w:t>
-      </w:r>
-      <w:proofErr w:type="spellEnd"/>
-      <w:r>
-        <w:t xml:space="preserve"> </w:t>
-      </w:r>
-      <w:proofErr w:type="spellStart"/>
-      <w:r>
-        <w:t>lost</w:t>
-      </w:r>
-      <w:proofErr w:type="spellEnd"/>
-      <w:r>
-        <w:t xml:space="preserve"> </w:t>
-      </w:r>
-      <w:proofErr w:type="spellStart"/>
-      <w:r>
-        <w:t>opportunities</w:t>
-      </w:r>
-      <w:proofErr w:type="spellEnd"/>
-      <w:r>
-        <w:t xml:space="preserve"> and </w:t>
-      </w:r>
-      <w:proofErr w:type="spellStart"/>
-      <w:r>
-        <w:t>an</w:t>
-      </w:r>
-      <w:proofErr w:type="spellEnd"/>
-      <w:r>
-        <w:t xml:space="preserve"> </w:t>
-      </w:r>
-      <w:proofErr w:type="spellStart"/>
-      <w:r>
-        <w:t>unprofessional</w:t>
-      </w:r>
-      <w:proofErr w:type="spellEnd"/>
-      <w:r>
-        <w:t xml:space="preserve"> </w:t>
-      </w:r>
-      <w:proofErr w:type="spellStart"/>
-      <w:r>
-        <w:t>image</w:t>
-      </w:r>
-      <w:proofErr w:type="spellEnd"/>
-      <w:r>
-        <w:t xml:space="preserve">. In response, a web </w:t>
-      </w:r>
-      <w:proofErr w:type="spellStart"/>
-      <w:r>
-        <w:t>platform</w:t>
-      </w:r>
-      <w:proofErr w:type="spellEnd"/>
-      <w:r>
-        <w:t xml:space="preserve"> </w:t>
-      </w:r>
-      <w:proofErr w:type="spellStart"/>
-      <w:r>
-        <w:t>was</w:t>
-      </w:r>
-      <w:proofErr w:type="spellEnd"/>
-      <w:r>
-        <w:t xml:space="preserve"> </w:t>
-      </w:r>
-      <w:proofErr w:type="spellStart"/>
-      <w:r>
-        <w:t>designed</w:t>
-      </w:r>
-      <w:proofErr w:type="spellEnd"/>
-      <w:r>
-        <w:t xml:space="preserve"> and </w:t>
-      </w:r>
-      <w:proofErr w:type="spellStart"/>
-      <w:r>
-        <w:t>built</w:t>
-      </w:r>
-      <w:proofErr w:type="spellEnd"/>
-      <w:r>
-        <w:t xml:space="preserve"> </w:t>
-      </w:r>
-      <w:proofErr w:type="spellStart"/>
-      <w:r>
-        <w:t>to</w:t>
-      </w:r>
-      <w:proofErr w:type="spellEnd"/>
-      <w:r>
-        <w:t xml:space="preserve"> </w:t>
-      </w:r>
-      <w:proofErr w:type="spellStart"/>
-      <w:r>
-        <w:t>automate</w:t>
-      </w:r>
-      <w:proofErr w:type="spellEnd"/>
-      <w:r>
-        <w:t xml:space="preserve"> </w:t>
-      </w:r>
-      <w:proofErr w:type="spellStart"/>
-      <w:r>
-        <w:t>the</w:t>
-      </w:r>
-      <w:proofErr w:type="spellEnd"/>
-      <w:r>
-        <w:t xml:space="preserve"> complete </w:t>
-      </w:r>
-      <w:proofErr w:type="spellStart"/>
-      <w:r>
-        <w:t>client</w:t>
-      </w:r>
-      <w:proofErr w:type="spellEnd"/>
-      <w:r>
-        <w:t xml:space="preserve"> </w:t>
-      </w:r>
-      <w:proofErr w:type="spellStart"/>
-      <w:r>
-        <w:lastRenderedPageBreak/>
-        <w:t>lifecycle</w:t>
-      </w:r>
-      <w:proofErr w:type="spellEnd"/>
-      <w:r>
-        <w:t xml:space="preserve"> </w:t>
-      </w:r>
-      <w:proofErr w:type="spellStart"/>
-      <w:r>
-        <w:t>through</w:t>
-      </w:r>
-      <w:proofErr w:type="spellEnd"/>
-      <w:r>
-        <w:t xml:space="preserve"> </w:t>
-      </w:r>
-      <w:proofErr w:type="spellStart"/>
-      <w:r>
-        <w:t>an</w:t>
-      </w:r>
-      <w:proofErr w:type="spellEnd"/>
-      <w:r>
-        <w:t xml:space="preserve"> </w:t>
-      </w:r>
-      <w:proofErr w:type="spellStart"/>
-      <w:r>
-        <w:t>event-driven</w:t>
-      </w:r>
-      <w:proofErr w:type="spellEnd"/>
-      <w:r>
-        <w:t xml:space="preserve"> </w:t>
-      </w:r>
-      <w:proofErr w:type="spellStart"/>
-      <w:r>
-        <w:t>architecture</w:t>
-      </w:r>
-      <w:proofErr w:type="spellEnd"/>
-      <w:r>
-        <w:t xml:space="preserve">. </w:t>
-      </w:r>
-      <w:proofErr w:type="spellStart"/>
-      <w:r>
-        <w:t>The</w:t>
-      </w:r>
-      <w:proofErr w:type="spellEnd"/>
-      <w:r>
-        <w:t xml:space="preserve"> </w:t>
-      </w:r>
-      <w:proofErr w:type="spellStart"/>
-      <w:r>
-        <w:t>solution</w:t>
-      </w:r>
-      <w:proofErr w:type="spellEnd"/>
-      <w:r>
-        <w:t xml:space="preserve"> </w:t>
-      </w:r>
-      <w:proofErr w:type="spellStart"/>
-      <w:r>
-        <w:t>integrates</w:t>
-      </w:r>
-      <w:proofErr w:type="spellEnd"/>
-      <w:r>
-        <w:t xml:space="preserve"> </w:t>
-      </w:r>
-      <w:proofErr w:type="spellStart"/>
-      <w:r>
-        <w:t>three</w:t>
-      </w:r>
-      <w:proofErr w:type="spellEnd"/>
-      <w:r>
-        <w:t xml:space="preserve"> </w:t>
-      </w:r>
-      <w:proofErr w:type="spellStart"/>
-      <w:r>
-        <w:t>layers</w:t>
-      </w:r>
-      <w:proofErr w:type="spellEnd"/>
-      <w:r>
-        <w:t xml:space="preserve">: a Next.js and </w:t>
-      </w:r>
-      <w:proofErr w:type="spellStart"/>
-      <w:r>
-        <w:t>React</w:t>
-      </w:r>
-      <w:proofErr w:type="spellEnd"/>
-      <w:r>
-        <w:t xml:space="preserve"> </w:t>
-      </w:r>
-      <w:proofErr w:type="spellStart"/>
-      <w:r>
-        <w:t>frontend</w:t>
-      </w:r>
-      <w:proofErr w:type="spellEnd"/>
-      <w:r>
-        <w:t xml:space="preserve"> </w:t>
-      </w:r>
-      <w:proofErr w:type="spellStart"/>
-      <w:r>
-        <w:t>exposing</w:t>
-      </w:r>
-      <w:proofErr w:type="spellEnd"/>
-      <w:r>
-        <w:t xml:space="preserve"> a </w:t>
-      </w:r>
-      <w:proofErr w:type="spellStart"/>
-      <w:r>
-        <w:t>public</w:t>
-      </w:r>
-      <w:proofErr w:type="spellEnd"/>
-      <w:r>
-        <w:t xml:space="preserve"> lead-capture </w:t>
-      </w:r>
-      <w:proofErr w:type="spellStart"/>
-      <w:r>
-        <w:t>form</w:t>
-      </w:r>
-      <w:proofErr w:type="spellEnd"/>
-      <w:r>
-        <w:t xml:space="preserve"> and </w:t>
-      </w:r>
-      <w:proofErr w:type="spellStart"/>
-      <w:r>
-        <w:t>an</w:t>
-      </w:r>
-      <w:proofErr w:type="spellEnd"/>
-      <w:r>
-        <w:t xml:space="preserve"> </w:t>
-      </w:r>
-      <w:proofErr w:type="spellStart"/>
-      <w:r>
-        <w:t>authenticated</w:t>
-      </w:r>
-      <w:proofErr w:type="spellEnd"/>
-      <w:r>
-        <w:t xml:space="preserve"> </w:t>
-      </w:r>
-      <w:proofErr w:type="spellStart"/>
-      <w:r>
-        <w:t>dashboard</w:t>
-      </w:r>
-      <w:proofErr w:type="spellEnd"/>
-      <w:r>
-        <w:t xml:space="preserve">; a </w:t>
-      </w:r>
-      <w:proofErr w:type="spellStart"/>
-      <w:r>
-        <w:t>low-code</w:t>
-      </w:r>
-      <w:proofErr w:type="spellEnd"/>
-      <w:r>
-        <w:t xml:space="preserve"> </w:t>
-      </w:r>
-      <w:proofErr w:type="spellStart"/>
-      <w:r>
-        <w:t>orchestration</w:t>
-      </w:r>
-      <w:proofErr w:type="spellEnd"/>
-      <w:r>
-        <w:t xml:space="preserve"> </w:t>
-      </w:r>
-      <w:proofErr w:type="spellStart"/>
-      <w:r>
-        <w:t>engine</w:t>
-      </w:r>
-      <w:proofErr w:type="spellEnd"/>
-      <w:r>
-        <w:t xml:space="preserve">, n8n, </w:t>
-      </w:r>
-      <w:proofErr w:type="spellStart"/>
-      <w:r>
-        <w:t>coordinating</w:t>
-      </w:r>
-      <w:proofErr w:type="spellEnd"/>
-      <w:r>
-        <w:t xml:space="preserve"> </w:t>
-      </w:r>
-      <w:proofErr w:type="spellStart"/>
-      <w:r>
-        <w:t>normalization</w:t>
-      </w:r>
-      <w:proofErr w:type="spellEnd"/>
-      <w:r>
-        <w:t xml:space="preserve">, </w:t>
-      </w:r>
-      <w:proofErr w:type="spellStart"/>
-      <w:r>
-        <w:t>scoring</w:t>
-      </w:r>
-      <w:proofErr w:type="spellEnd"/>
-      <w:r>
-        <w:t xml:space="preserve">, </w:t>
-      </w:r>
-      <w:proofErr w:type="spellStart"/>
-      <w:r>
-        <w:t>proposal</w:t>
-      </w:r>
-      <w:proofErr w:type="spellEnd"/>
-      <w:r>
-        <w:t xml:space="preserve"> and </w:t>
-      </w:r>
-      <w:proofErr w:type="spellStart"/>
-      <w:r>
-        <w:t>invoice</w:t>
-      </w:r>
-      <w:proofErr w:type="spellEnd"/>
-      <w:r>
-        <w:t xml:space="preserve"> </w:t>
-      </w:r>
-      <w:proofErr w:type="spellStart"/>
-      <w:r>
-        <w:t>generation</w:t>
-      </w:r>
-      <w:proofErr w:type="spellEnd"/>
-      <w:r>
-        <w:t xml:space="preserve"> and </w:t>
-      </w:r>
-      <w:proofErr w:type="spellStart"/>
-      <w:r>
-        <w:t>multichannel</w:t>
-      </w:r>
-      <w:proofErr w:type="spellEnd"/>
-      <w:r>
-        <w:t xml:space="preserve"> </w:t>
-      </w:r>
-      <w:proofErr w:type="spellStart"/>
-      <w:r>
-        <w:t>notifications</w:t>
-      </w:r>
-      <w:proofErr w:type="spellEnd"/>
-      <w:r>
-        <w:t xml:space="preserve">; and a </w:t>
-      </w:r>
-      <w:proofErr w:type="spellStart"/>
-      <w:r>
-        <w:t>managed</w:t>
-      </w:r>
-      <w:proofErr w:type="spellEnd"/>
-      <w:r>
-        <w:t xml:space="preserve"> </w:t>
-      </w:r>
-      <w:proofErr w:type="spellStart"/>
-      <w:r>
-        <w:t>relational</w:t>
-      </w:r>
-      <w:proofErr w:type="spellEnd"/>
-      <w:r>
-        <w:t xml:space="preserve"> </w:t>
-      </w:r>
-      <w:proofErr w:type="spellStart"/>
-      <w:r>
-        <w:t>database</w:t>
-      </w:r>
-      <w:proofErr w:type="spellEnd"/>
-      <w:r>
-        <w:t xml:space="preserve">, </w:t>
-      </w:r>
-      <w:proofErr w:type="spellStart"/>
-      <w:r>
-        <w:t>Supabase</w:t>
-      </w:r>
-      <w:proofErr w:type="spellEnd"/>
-      <w:r>
-        <w:t xml:space="preserve"> (PostgreSQL), </w:t>
-      </w:r>
-      <w:proofErr w:type="spellStart"/>
-      <w:r>
-        <w:t>with</w:t>
-      </w:r>
-      <w:proofErr w:type="spellEnd"/>
-      <w:r>
-        <w:t xml:space="preserve"> </w:t>
-      </w:r>
-      <w:proofErr w:type="spellStart"/>
-      <w:r>
-        <w:t>row-level</w:t>
-      </w:r>
-      <w:proofErr w:type="spellEnd"/>
-      <w:r>
-        <w:t xml:space="preserve"> </w:t>
-      </w:r>
-      <w:proofErr w:type="spellStart"/>
-      <w:r>
-        <w:t>security</w:t>
-      </w:r>
-      <w:proofErr w:type="spellEnd"/>
-      <w:r>
-        <w:t xml:space="preserve">. </w:t>
-      </w:r>
-      <w:proofErr w:type="spellStart"/>
-      <w:r>
-        <w:t>The</w:t>
-      </w:r>
-      <w:proofErr w:type="spellEnd"/>
-      <w:r>
-        <w:t xml:space="preserve"> </w:t>
-      </w:r>
-      <w:proofErr w:type="spellStart"/>
-      <w:r>
-        <w:t>system</w:t>
-      </w:r>
-      <w:proofErr w:type="spellEnd"/>
-      <w:r>
-        <w:t xml:space="preserve"> </w:t>
-      </w:r>
-      <w:proofErr w:type="spellStart"/>
-      <w:r>
-        <w:t>automatically</w:t>
-      </w:r>
-      <w:proofErr w:type="spellEnd"/>
-      <w:r>
-        <w:t xml:space="preserve"> computes a </w:t>
-      </w:r>
-      <w:proofErr w:type="spellStart"/>
-      <w:r>
-        <w:t>priority</w:t>
-      </w:r>
-      <w:proofErr w:type="spellEnd"/>
-      <w:r>
-        <w:t xml:space="preserve"> score </w:t>
-      </w:r>
-      <w:proofErr w:type="spellStart"/>
-      <w:r>
-        <w:t>that</w:t>
-      </w:r>
-      <w:proofErr w:type="spellEnd"/>
-      <w:r>
-        <w:t xml:space="preserve"> </w:t>
-      </w:r>
-      <w:proofErr w:type="spellStart"/>
-      <w:r>
-        <w:t>classifies</w:t>
-      </w:r>
-      <w:proofErr w:type="spellEnd"/>
-      <w:r>
-        <w:t xml:space="preserve"> </w:t>
-      </w:r>
-      <w:proofErr w:type="spellStart"/>
-      <w:r>
-        <w:t>each</w:t>
-      </w:r>
-      <w:proofErr w:type="spellEnd"/>
-      <w:r>
-        <w:t xml:space="preserve"> lead </w:t>
-      </w:r>
-      <w:proofErr w:type="spellStart"/>
-      <w:r>
-        <w:t>into</w:t>
-      </w:r>
-      <w:proofErr w:type="spellEnd"/>
-      <w:r>
-        <w:t xml:space="preserve"> </w:t>
-      </w:r>
-      <w:proofErr w:type="spellStart"/>
-      <w:r>
-        <w:t>three</w:t>
-      </w:r>
-      <w:proofErr w:type="spellEnd"/>
-      <w:r>
-        <w:t xml:space="preserve"> </w:t>
-      </w:r>
-      <w:proofErr w:type="spellStart"/>
-      <w:r>
-        <w:t>tiers</w:t>
-      </w:r>
-      <w:proofErr w:type="spellEnd"/>
-      <w:r>
-        <w:t xml:space="preserve"> (HOT, WARM, COLD), </w:t>
-      </w:r>
-      <w:proofErr w:type="spellStart"/>
-      <w:r>
-        <w:t>triggers</w:t>
-      </w:r>
-      <w:proofErr w:type="spellEnd"/>
-      <w:r>
-        <w:t xml:space="preserve"> </w:t>
-      </w:r>
-      <w:proofErr w:type="spellStart"/>
-      <w:r>
-        <w:t>proposals</w:t>
-      </w:r>
-      <w:proofErr w:type="spellEnd"/>
-      <w:r>
-        <w:t xml:space="preserve"> </w:t>
-      </w:r>
-      <w:proofErr w:type="spellStart"/>
-      <w:r>
-        <w:t>by</w:t>
-      </w:r>
-      <w:proofErr w:type="spellEnd"/>
-      <w:r>
-        <w:t xml:space="preserve"> e-mail, </w:t>
-      </w:r>
-      <w:proofErr w:type="spellStart"/>
-      <w:r>
-        <w:t>enables</w:t>
-      </w:r>
-      <w:proofErr w:type="spellEnd"/>
-      <w:r>
-        <w:t xml:space="preserve"> </w:t>
-      </w:r>
-      <w:proofErr w:type="spellStart"/>
-      <w:r>
-        <w:t>acceptance</w:t>
-      </w:r>
-      <w:proofErr w:type="spellEnd"/>
-      <w:r>
-        <w:t xml:space="preserve"> </w:t>
-      </w:r>
-      <w:proofErr w:type="spellStart"/>
-      <w:r>
-        <w:t>through</w:t>
-      </w:r>
-      <w:proofErr w:type="spellEnd"/>
-      <w:r>
-        <w:t xml:space="preserve"> a single-use </w:t>
-      </w:r>
-      <w:proofErr w:type="spellStart"/>
-      <w:r>
-        <w:t>tokenized</w:t>
-      </w:r>
-      <w:proofErr w:type="spellEnd"/>
-      <w:r>
-        <w:t xml:space="preserve"> link, </w:t>
-      </w:r>
-      <w:proofErr w:type="spellStart"/>
-      <w:r>
-        <w:t>generates</w:t>
-      </w:r>
-      <w:proofErr w:type="spellEnd"/>
-      <w:r>
-        <w:t xml:space="preserve"> a PDF </w:t>
-      </w:r>
-      <w:proofErr w:type="spellStart"/>
-      <w:r>
-        <w:t>invoice</w:t>
-      </w:r>
-      <w:proofErr w:type="spellEnd"/>
-      <w:r>
-        <w:t xml:space="preserve"> and </w:t>
-      </w:r>
-      <w:proofErr w:type="spellStart"/>
-      <w:r>
-        <w:t>runs</w:t>
-      </w:r>
-      <w:proofErr w:type="spellEnd"/>
-      <w:r>
-        <w:t xml:space="preserve"> </w:t>
-      </w:r>
-      <w:proofErr w:type="spellStart"/>
-      <w:r>
-        <w:t>scheduled</w:t>
-      </w:r>
-      <w:proofErr w:type="spellEnd"/>
-      <w:r>
-        <w:t xml:space="preserve"> </w:t>
-      </w:r>
-      <w:proofErr w:type="spellStart"/>
-      <w:r>
-        <w:t>follow</w:t>
-      </w:r>
-      <w:proofErr w:type="spellEnd"/>
-      <w:r>
-        <w:t xml:space="preserve">-up, </w:t>
-      </w:r>
-      <w:proofErr w:type="spellStart"/>
-      <w:r>
-        <w:t>payment-reminder</w:t>
-      </w:r>
-      <w:proofErr w:type="spellEnd"/>
-      <w:r>
-        <w:t xml:space="preserve"> and </w:t>
-      </w:r>
-      <w:proofErr w:type="spellStart"/>
-      <w:r>
-        <w:t>daily-metrics</w:t>
-      </w:r>
-      <w:proofErr w:type="spellEnd"/>
-      <w:r>
-        <w:t xml:space="preserve"> </w:t>
-      </w:r>
-      <w:proofErr w:type="spellStart"/>
-      <w:r>
-        <w:t>processes</w:t>
-      </w:r>
-      <w:proofErr w:type="spellEnd"/>
-      <w:r>
-        <w:t xml:space="preserve">. </w:t>
-      </w:r>
-      <w:proofErr w:type="spellStart"/>
-      <w:r>
-        <w:t>Validation</w:t>
-      </w:r>
-      <w:proofErr w:type="spellEnd"/>
-      <w:r>
-        <w:t xml:space="preserve"> </w:t>
-      </w:r>
-      <w:proofErr w:type="spellStart"/>
-      <w:r>
-        <w:t>through</w:t>
-      </w:r>
-      <w:proofErr w:type="spellEnd"/>
-      <w:r>
-        <w:t xml:space="preserve"> </w:t>
-      </w:r>
-      <w:proofErr w:type="spellStart"/>
-      <w:r>
-        <w:t>controlled</w:t>
-      </w:r>
-      <w:proofErr w:type="spellEnd"/>
-      <w:r>
-        <w:t xml:space="preserve"> </w:t>
-      </w:r>
-      <w:proofErr w:type="spellStart"/>
-      <w:r>
-        <w:t>scenarios</w:t>
-      </w:r>
-      <w:proofErr w:type="spellEnd"/>
-      <w:r>
-        <w:t xml:space="preserve"> </w:t>
-      </w:r>
-      <w:proofErr w:type="spellStart"/>
-      <w:r>
-        <w:t>verified</w:t>
-      </w:r>
-      <w:proofErr w:type="spellEnd"/>
-      <w:r>
-        <w:t xml:space="preserve"> </w:t>
-      </w:r>
-      <w:proofErr w:type="spellStart"/>
-      <w:r>
-        <w:t>the</w:t>
-      </w:r>
-      <w:proofErr w:type="spellEnd"/>
-      <w:r>
-        <w:t xml:space="preserve"> </w:t>
-      </w:r>
-      <w:proofErr w:type="spellStart"/>
-      <w:r>
-        <w:t>end-to-end</w:t>
-      </w:r>
-      <w:proofErr w:type="spellEnd"/>
-      <w:r>
-        <w:t xml:space="preserve"> </w:t>
-      </w:r>
-      <w:proofErr w:type="spellStart"/>
-      <w:r>
-        <w:t>operation</w:t>
-      </w:r>
-      <w:proofErr w:type="spellEnd"/>
-      <w:r>
-        <w:t xml:space="preserve"> </w:t>
-      </w:r>
-      <w:proofErr w:type="spellStart"/>
-      <w:r>
-        <w:t>of</w:t>
-      </w:r>
-      <w:proofErr w:type="spellEnd"/>
-      <w:r>
-        <w:t xml:space="preserve"> </w:t>
-      </w:r>
-      <w:proofErr w:type="spellStart"/>
-      <w:r>
-        <w:t>the</w:t>
-      </w:r>
-      <w:proofErr w:type="spellEnd"/>
-      <w:r>
-        <w:t xml:space="preserve"> capture, </w:t>
-      </w:r>
-      <w:proofErr w:type="spellStart"/>
-      <w:r>
-        <w:t>qualification</w:t>
-      </w:r>
-      <w:proofErr w:type="spellEnd"/>
-      <w:r>
-        <w:t xml:space="preserve">, </w:t>
-      </w:r>
-      <w:proofErr w:type="spellStart"/>
-      <w:r>
-        <w:t>acceptance</w:t>
-      </w:r>
-      <w:proofErr w:type="spellEnd"/>
-      <w:r>
-        <w:t xml:space="preserve"> and </w:t>
-      </w:r>
-      <w:proofErr w:type="spellStart"/>
-      <w:r>
-        <w:t>invoicing</w:t>
-      </w:r>
-      <w:proofErr w:type="spellEnd"/>
-      <w:r>
-        <w:t xml:space="preserve"> </w:t>
-      </w:r>
-      <w:proofErr w:type="spellStart"/>
-      <w:r>
-        <w:t>flows</w:t>
-      </w:r>
-      <w:proofErr w:type="spellEnd"/>
-      <w:r>
-        <w:t xml:space="preserve">, as </w:t>
-      </w:r>
-      <w:proofErr w:type="spellStart"/>
-      <w:r>
-        <w:t>well</w:t>
-      </w:r>
-      <w:proofErr w:type="spellEnd"/>
-      <w:r>
-        <w:t xml:space="preserve"> as </w:t>
-      </w:r>
-      <w:proofErr w:type="spellStart"/>
-      <w:r>
-        <w:t>the</w:t>
-      </w:r>
-      <w:proofErr w:type="spellEnd"/>
-      <w:r>
-        <w:t xml:space="preserve"> real-time </w:t>
-      </w:r>
-      <w:proofErr w:type="spellStart"/>
-      <w:r>
-        <w:t>update</w:t>
-      </w:r>
-      <w:proofErr w:type="spellEnd"/>
-      <w:r>
-        <w:t xml:space="preserve"> </w:t>
-      </w:r>
-      <w:proofErr w:type="spellStart"/>
-      <w:r>
-        <w:t>of</w:t>
-      </w:r>
-      <w:proofErr w:type="spellEnd"/>
-      <w:r>
-        <w:t xml:space="preserve"> </w:t>
-      </w:r>
-      <w:proofErr w:type="spellStart"/>
-      <w:r>
-        <w:t>the</w:t>
-      </w:r>
-      <w:proofErr w:type="spellEnd"/>
-      <w:r>
-        <w:t xml:space="preserve"> </w:t>
-      </w:r>
-      <w:proofErr w:type="spellStart"/>
-      <w:r>
-        <w:t>dashboard</w:t>
-      </w:r>
-      <w:proofErr w:type="spellEnd"/>
-      <w:r>
-        <w:t>.</w:t>
-      </w:r>
-    </w:p>
-    <w:p/>
-    <w:p>
-      <w:proofErr w:type="spellStart"/>
-      <w:r>
-        <w:rPr>
-          <w:b/>
-        </w:rPr>
-        <w:t>Keywords</w:t>
-      </w:r>
-      <w:proofErr w:type="spellEnd"/>
-      <w:r>
-        <w:rPr>
-          <w:b/>
-        </w:rPr>
-        <w:t>:</w:t>
-      </w:r>
-      <w:r>
-        <w:t xml:space="preserve"> </w:t>
-      </w:r>
-      <w:proofErr w:type="spellStart"/>
-      <w:r>
-        <w:t>process</w:t>
-      </w:r>
-      <w:proofErr w:type="spellEnd"/>
-      <w:r>
-        <w:t xml:space="preserve"> </w:t>
-      </w:r>
-      <w:proofErr w:type="spellStart"/>
-      <w:r>
-        <w:t>automation</w:t>
-      </w:r>
-      <w:proofErr w:type="spellEnd"/>
-      <w:r>
-        <w:t xml:space="preserve">; </w:t>
-      </w:r>
-      <w:proofErr w:type="spellStart"/>
-      <w:r>
-        <w:t>workflow</w:t>
-      </w:r>
-      <w:proofErr w:type="spellEnd"/>
-      <w:r>
-        <w:t xml:space="preserve"> </w:t>
-      </w:r>
-      <w:proofErr w:type="spellStart"/>
-      <w:r>
-        <w:t>orchestration</w:t>
-      </w:r>
-      <w:proofErr w:type="spellEnd"/>
-      <w:r>
-        <w:t xml:space="preserve">; n8n; lead </w:t>
-      </w:r>
-      <w:proofErr w:type="spellStart"/>
-      <w:r>
-        <w:t>management</w:t>
-      </w:r>
-      <w:proofErr w:type="spellEnd"/>
-      <w:r>
-        <w:t xml:space="preserve">; </w:t>
-      </w:r>
-      <w:proofErr w:type="spellStart"/>
-      <w:r>
-        <w:t>scoring</w:t>
-      </w:r>
-      <w:proofErr w:type="spellEnd"/>
-      <w:r>
-        <w:t xml:space="preserve">; </w:t>
-      </w:r>
-      <w:proofErr w:type="spellStart"/>
-      <w:r>
-        <w:t>event-driven</w:t>
-      </w:r>
-      <w:proofErr w:type="spellEnd"/>
-      <w:r>
-        <w:t xml:space="preserve"> </w:t>
-      </w:r>
-      <w:proofErr w:type="spellStart"/>
-      <w:r>
-        <w:t>architecture</w:t>
-      </w:r>
-      <w:proofErr w:type="spellEnd"/>
-      <w:r>
-        <w:t xml:space="preserve">; </w:t>
-      </w:r>
-      <w:proofErr w:type="spellStart"/>
-      <w:r>
-        <w:t>Supabase</w:t>
-      </w:r>
-      <w:proofErr w:type="spellEnd"/>
-      <w:r>
-        <w:t>; Next.js.</w:t>
-      </w:r>
-    </w:p>
     <w:p>
       <w:r>
         <w:br w:type="page"/>
@@ -1491,77 +327,6 @@
             <w:webHidden/>
           </w:rPr>
           <w:instrText xml:space="preserve"> PAGEREF _Toc233808406 \h </w:instrText>
-        </w:r>
-        <w:r>
-          <w:rPr>
-            <w:noProof/>
-            <w:webHidden/>
-          </w:rPr>
-        </w:r>
-        <w:r>
-          <w:rPr>
-            <w:noProof/>
-            <w:webHidden/>
-          </w:rPr>
-          <w:fldChar w:fldCharType="separate"/>
-        </w:r>
-        <w:r>
-          <w:rPr>
-            <w:noProof/>
-            <w:webHidden/>
-          </w:rPr>
-          <w:t>2</w:t>
-        </w:r>
-        <w:r>
-          <w:rPr>
-            <w:noProof/>
-            <w:webHidden/>
-          </w:rPr>
-          <w:fldChar w:fldCharType="end"/>
-        </w:r>
-      </w:hyperlink>
-    </w:p>
-    <w:p>
-      <w:pPr>
-        <w:pStyle w:val="TDC2"/>
-        <w:tabs>
-          <w:tab w:val="right" w:leader="dot" w:pos="8778"/>
-        </w:tabs>
-        <w:rPr>
-          <w:rFonts w:asciiTheme="minorHAnsi" w:eastAsiaTheme="minorEastAsia" w:hAnsiTheme="minorHAnsi" w:cstheme="minorBidi"/>
-          <w:noProof/>
-          <w:kern w:val="2"/>
-          <w14:ligatures w14:val="standardContextual"/>
-        </w:rPr>
-      </w:pPr>
-      <w:hyperlink w:anchor="_Toc233808407" w:history="1">
-        <w:r>
-          <w:rPr>
-            <w:rStyle w:val="Hipervnculo"/>
-            <w:noProof/>
-          </w:rPr>
-          <w:t>Abstract</w:t>
-        </w:r>
-        <w:r>
-          <w:rPr>
-            <w:noProof/>
-            <w:webHidden/>
-          </w:rPr>
-          <w:tab/>
-        </w:r>
-        <w:r>
-          <w:rPr>
-            <w:noProof/>
-            <w:webHidden/>
-          </w:rPr>
-          <w:fldChar w:fldCharType="begin"/>
-        </w:r>
-        <w:r>
-          <w:rPr>
-            <w:noProof/>
-            <w:webHidden/>
-          </w:rPr>
-          <w:instrText xml:space="preserve"> PAGEREF _Toc233808407 \h </w:instrText>
         </w:r>
         <w:r>
           <w:rPr>

</xml_diff>